<commit_message>
Rootworks backup: 2026-08-13 17:35:24
</commit_message>
<xml_diff>
--- a/Clients/Piper AI/Shared/Piper AI - Not-Interested Reply Log (Full Program) - 2026-08-12.docx
+++ b/Clients/Piper AI/Shared/Piper AI - Not-Interested Reply Log (Full Program) - 2026-08-12.docx
@@ -2,27 +2,6 @@
 <file path=word/document.xml><?xml version="1.0" encoding="utf-8"?>
 <w:document xmlns:w="http://schemas.openxmlformats.org/wordprocessingml/2006/main" xmlns:m="http://schemas.openxmlformats.org/officeDocument/2006/math" xmlns:r="http://schemas.openxmlformats.org/officeDocument/2006/relationships" xmlns:o="urn:schemas-microsoft-com:office:office" xmlns:v="urn:schemas-microsoft-com:vml" xmlns:w10="urn:schemas-microsoft-com:office:word" xmlns:a="http://schemas.openxmlformats.org/drawingml/2006/main" xmlns:pic="http://schemas.openxmlformats.org/drawingml/2006/picture" xmlns:wp="http://schemas.openxmlformats.org/drawingml/2006/wordprocessingDrawing">
   <w:body>
-    <w:bookmarkStart w:id="21" w:name="X415698b618cdc4b1a4825c84fce4f5d73833c70"/>
-    <w:p>
-      <w:pPr>
-        <w:pStyle w:val="Heading1"/>
-      </w:pPr>
-      <w:r>
-        <w:t xml:space="preserve">Piper AI —</w:t>
-      </w:r>
-      <w:r>
-        <w:t xml:space="preserve"> </w:t>
-      </w:r>
-      <w:r>
-        <w:t xml:space="preserve">“No Thanks”</w:t>
-      </w:r>
-      <w:r>
-        <w:t xml:space="preserve"> </w:t>
-      </w:r>
-      <w:r>
-        <w:t xml:space="preserve">/ Not-Interested Reply Log (Full Program)</w:t>
-      </w:r>
-    </w:p>
     <w:p>
       <w:pPr>
         <w:pStyle w:val="FirstParagraph"/>
@@ -88,22 +67,6 @@
       <w:r>
         <w:t xml:space="preserve">Every Piper GC-CMAR cold-email campaign, 2026-06-24 to 2026-08-12</w:t>
       </w:r>
-      <w:r>
-        <w:t xml:space="preserve"> </w:t>
-      </w:r>
-      <w:r>
-        <w:rPr>
-          <w:b/>
-          <w:bCs/>
-        </w:rPr>
-        <w:t xml:space="preserve">Method:</w:t>
-      </w:r>
-      <w:r>
-        <w:t xml:space="preserve"> </w:t>
-      </w:r>
-      <w:r>
-        <w:t xml:space="preserve">Full pull of every reply labelled not-interested in the sending platform, paginated to the end of the label, deduped by thread, isolated to Piper’s 15 GC-CMAR campaigns. Flowroots’ own campaigns sharing the workspace are excluded.</w:t>
-      </w:r>
     </w:p>
     <w:p>
       <w:pPr>
@@ -115,29 +78,6 @@
           <w:bCs/>
         </w:rPr>
         <w:t xml:space="preserve">Total: 50 unique not-interested replies, against 20,915 emails sent and 12,047 people contacted.</w:t>
-      </w:r>
-    </w:p>
-    <w:p>
-      <w:pPr>
-        <w:pStyle w:val="BodyText"/>
-      </w:pPr>
-      <w:r>
-        <w:t xml:space="preserve">This supersedes</w:t>
-      </w:r>
-      <w:r>
-        <w:t xml:space="preserve"> </w:t>
-      </w:r>
-      <w:r>
-        <w:rPr>
-          <w:rStyle w:val="VerbatimChar"/>
-        </w:rPr>
-        <w:t xml:space="preserve">Piper AI - Not-Interested Reply Log with Company Profiles - 2026-07-09.md</w:t>
-      </w:r>
-      <w:r>
-        <w:t xml:space="preserve"> </w:t>
-      </w:r>
-      <w:r>
-        <w:t xml:space="preserve">(06-24 to 07-08), which is now the first third of this record.</w:t>
       </w:r>
     </w:p>
     <w:p>
@@ -2433,731 +2373,8 @@
         <w:t xml:space="preserve">Signal: Opt-out</w:t>
       </w:r>
     </w:p>
-    <w:p>
-      <w:r>
-        <w:pict>
-          <v:rect style="width:0;height:1.5pt" o:hralign="center" o:hrstd="t" o:hr="t"/>
-        </w:pict>
-      </w:r>
-    </w:p>
     <w:bookmarkEnd w:id="12"/>
     <w:bookmarkEnd w:id="13"/>
-    <w:bookmarkStart w:id="19" w:name="signal-read"/>
-    <w:p>
-      <w:pPr>
-        <w:pStyle w:val="Heading2"/>
-      </w:pPr>
-      <w:r>
-        <w:t xml:space="preserve">Signal read</w:t>
-      </w:r>
-    </w:p>
-    <w:bookmarkStart w:id="14" w:name="X179684ffde2cc257dc568dd539f864313165020"/>
-    <w:p>
-      <w:pPr>
-        <w:pStyle w:val="Heading3"/>
-      </w:pPr>
-      <w:r>
-        <w:t xml:space="preserve">1. Nobody is arguing with the offer. Almost nobody is engaging with it.</w:t>
-      </w:r>
-    </w:p>
-    <w:p>
-      <w:pPr>
-        <w:pStyle w:val="FirstParagraph"/>
-      </w:pPr>
-      <w:r>
-        <w:t xml:space="preserve">Forty-eight of 50 replies are a one-line refusal.</w:t>
-      </w:r>
-      <w:r>
-        <w:t xml:space="preserve"> </w:t>
-      </w:r>
-      <w:r>
-        <w:rPr>
-          <w:b/>
-          <w:bCs/>
-        </w:rPr>
-        <w:t xml:space="preserve">Two</w:t>
-      </w:r>
-      <w:r>
-        <w:t xml:space="preserve"> </w:t>
-      </w:r>
-      <w:r>
-        <w:t xml:space="preserve">in the whole program gave a reason:</w:t>
-      </w:r>
-    </w:p>
-    <w:p>
-      <w:pPr>
-        <w:pStyle w:val="Compact"/>
-        <w:numPr>
-          <w:ilvl w:val="0"/>
-          <w:numId w:val="1001"/>
-        </w:numPr>
-      </w:pPr>
-      <w:r>
-        <w:rPr>
-          <w:b/>
-          <w:bCs/>
-        </w:rPr>
-        <w:t xml:space="preserve">Tony Latoria (Director of Preconstruction, Russell)</w:t>
-      </w:r>
-      <w:r>
-        <w:t xml:space="preserve"> </w:t>
-      </w:r>
-      <w:r>
-        <w:t xml:space="preserve">— already built contract-review prompts and a risk register on enterprise AI, in shared co-work environments. This is the</w:t>
-      </w:r>
-      <w:r>
-        <w:t xml:space="preserve"> </w:t>
-      </w:r>
-      <w:r>
-        <w:t xml:space="preserve">“just use ChatGPT”</w:t>
-      </w:r>
-      <w:r>
-        <w:t xml:space="preserve"> </w:t>
-      </w:r>
-      <w:r>
-        <w:t xml:space="preserve">objection, from the exact buyer, unprompted. It is the single most useful thing any prospect has told us, and the</w:t>
-      </w:r>
-      <w:r>
-        <w:t xml:space="preserve"> </w:t>
-      </w:r>
-      <w:r>
-        <w:t xml:space="preserve">“evolving brain / persistent context”</w:t>
-      </w:r>
-      <w:r>
-        <w:t xml:space="preserve"> </w:t>
-      </w:r>
-      <w:r>
-        <w:t xml:space="preserve">differentiator exists to answer it: their build resets every session, ours does not.</w:t>
-      </w:r>
-    </w:p>
-    <w:p>
-      <w:pPr>
-        <w:pStyle w:val="Compact"/>
-        <w:numPr>
-          <w:ilvl w:val="0"/>
-          <w:numId w:val="1001"/>
-        </w:numPr>
-      </w:pPr>
-      <w:r>
-        <w:rPr>
-          <w:b/>
-          <w:bCs/>
-        </w:rPr>
-        <w:t xml:space="preserve">Sheila Suppes (BD Manager, Clark)</w:t>
-      </w:r>
-      <w:r>
-        <w:t xml:space="preserve"> </w:t>
-      </w:r>
-      <w:r>
-        <w:t xml:space="preserve">—</w:t>
-      </w:r>
-      <w:r>
-        <w:t xml:space="preserve"> </w:t>
-      </w:r>
-      <w:r>
-        <w:t xml:space="preserve">“we have an estimating team.”</w:t>
-      </w:r>
-      <w:r>
-        <w:t xml:space="preserve"> </w:t>
-      </w:r>
-      <w:r>
-        <w:t xml:space="preserve">The</w:t>
-      </w:r>
-      <w:r>
-        <w:t xml:space="preserve"> </w:t>
-      </w:r>
-      <w:r>
-        <w:t xml:space="preserve">“we already do this”</w:t>
-      </w:r>
-      <w:r>
-        <w:t xml:space="preserve"> </w:t>
-      </w:r>
-      <w:r>
-        <w:t xml:space="preserve">objection; answered by velocity and depth, not replacement.</w:t>
-      </w:r>
-    </w:p>
-    <w:p>
-      <w:pPr>
-        <w:pStyle w:val="FirstParagraph"/>
-      </w:pPr>
-      <w:r>
-        <w:t xml:space="preserve">Across 20,915 sends, two people engaged with the substance. That is not a positioning rejection. It is an attention failure — the message is not being read as being about them.</w:t>
-      </w:r>
-    </w:p>
-    <w:bookmarkEnd w:id="14"/>
-    <w:bookmarkStart w:id="15" w:name="X271e49d6d39f290a5410aa0333edeef1999a282"/>
-    <w:p>
-      <w:pPr>
-        <w:pStyle w:val="Heading3"/>
-      </w:pPr>
-      <w:r>
-        <w:t xml:space="preserve">2. Personalisation failures are visible in the replies themselves.</w:t>
-      </w:r>
-    </w:p>
-    <w:p>
-      <w:pPr>
-        <w:pStyle w:val="FirstParagraph"/>
-      </w:pPr>
-      <w:r>
-        <w:rPr>
-          <w:b/>
-          <w:bCs/>
-        </w:rPr>
-        <w:t xml:space="preserve">Wrong first name (4):</w:t>
-      </w:r>
-      <w:r>
-        <w:t xml:space="preserve"> </w:t>
-      </w:r>
-      <w:r>
-        <w:t xml:space="preserve">Clune (</w:t>
-      </w:r>
-      <w:r>
-        <w:t xml:space="preserve">“my name is NOT Matt so I assume you are not a real person”</w:t>
-      </w:r>
-      <w:r>
-        <w:t xml:space="preserve">), Pogue (</w:t>
-      </w:r>
-      <w:r>
-        <w:t xml:space="preserve">“Hey Penny”</w:t>
-      </w:r>
-      <w:r>
-        <w:t xml:space="preserve"> </w:t>
-      </w:r>
-      <w:r>
-        <w:t xml:space="preserve">→ Paul), BHI (</w:t>
-      </w:r>
-      <w:r>
-        <w:t xml:space="preserve">“Hey John”</w:t>
-      </w:r>
-      <w:r>
-        <w:t xml:space="preserve"> </w:t>
-      </w:r>
-      <w:r>
-        <w:t xml:space="preserve">→ Jake), La Macchia (</w:t>
-      </w:r>
-      <w:r>
-        <w:t xml:space="preserve">“Hi Charles”</w:t>
-      </w:r>
-      <w:r>
-        <w:t xml:space="preserve"> </w:t>
-      </w:r>
-      <w:r>
-        <w:t xml:space="preserve">→ Charlie), plus Espace’s broken casing (</w:t>
-      </w:r>
-      <w:r>
-        <w:t xml:space="preserve">“Charles-henri”</w:t>
-      </w:r>
-      <w:r>
-        <w:t xml:space="preserve">).</w:t>
-      </w:r>
-    </w:p>
-    <w:p>
-      <w:pPr>
-        <w:pStyle w:val="BodyText"/>
-      </w:pPr>
-      <w:r>
-        <w:rPr>
-          <w:b/>
-          <w:bCs/>
-        </w:rPr>
-        <w:t xml:space="preserve">Wrong recipient (1):</w:t>
-      </w:r>
-      <w:r>
-        <w:t xml:space="preserve"> </w:t>
-      </w:r>
-      <w:r>
-        <w:t xml:space="preserve">Burton Construction’s mail was addressed to Jeff Lynch and answered by a colleague.</w:t>
-      </w:r>
-    </w:p>
-    <w:p>
-      <w:pPr>
-        <w:pStyle w:val="BodyText"/>
-      </w:pPr>
-      <w:r>
-        <w:rPr>
-          <w:b/>
-          <w:bCs/>
-        </w:rPr>
-        <w:t xml:space="preserve">Stale contact:</w:t>
-      </w:r>
-      <w:r>
-        <w:t xml:space="preserve"> </w:t>
-      </w:r>
-      <w:r>
-        <w:t xml:space="preserve">Roger Hickel had retired.</w:t>
-      </w:r>
-    </w:p>
-    <w:p>
-      <w:pPr>
-        <w:pStyle w:val="BodyText"/>
-      </w:pPr>
-      <w:r>
-        <w:t xml:space="preserve">The Clune reply is the one to sit with. A wrong merge field did not just lose that lead — it told him the sender was a bot, in writing. Every other lead who spotted the same error and simply deleted the mail is invisible in these numbers.</w:t>
-      </w:r>
-    </w:p>
-    <w:bookmarkEnd w:id="15"/>
-    <w:bookmarkStart w:id="16" w:name="the-right-seats-are-saying-no-too."/>
-    <w:p>
-      <w:pPr>
-        <w:pStyle w:val="Heading3"/>
-      </w:pPr>
-      <w:r>
-        <w:t xml:space="preserve">3. The right seats are saying no too.</w:t>
-      </w:r>
-    </w:p>
-    <w:p>
-      <w:pPr>
-        <w:pStyle w:val="FirstParagraph"/>
-      </w:pPr>
-      <w:r>
-        <w:t xml:space="preserve">Thirteen replies came from precisely the seats we target — Directors of Preconstruction, COOs, Presidents, BD Directors, chief estimators: Latoria (Russell), Shea (OCL), Saunders (Trumbull-Nelson), Clemency (La Macchia), Burnette (Hoar), Brinkman (Sampson), Pfannes (Miller-Davis), Suppes (Clark), Clementi (D&amp;P), Heinen (TerWisscha), Dohn (DOHN), Uffelman (Scott-Long), Allen (CNY).</w:t>
-      </w:r>
-    </w:p>
-    <w:p>
-      <w:pPr>
-        <w:pStyle w:val="BodyText"/>
-      </w:pPr>
-      <w:r>
-        <w:rPr>
-          <w:b/>
-          <w:bCs/>
-        </w:rPr>
-        <w:t xml:space="preserve">This is not a targeting problem.</w:t>
-      </w:r>
-      <w:r>
-        <w:t xml:space="preserve"> </w:t>
-      </w:r>
-      <w:r>
-        <w:t xml:space="preserve">The right people are receiving the mail and declining it. Notably,</w:t>
-      </w:r>
-      <w:r>
-        <w:t xml:space="preserve"> </w:t>
-      </w:r>
-      <w:r>
-        <w:rPr>
-          <w:b/>
-          <w:bCs/>
-        </w:rPr>
-        <w:t xml:space="preserve">Brittian Blaylock, Director of Construction Technology at Edifice</w:t>
-      </w:r>
-      <w:r>
-        <w:t xml:space="preserve"> </w:t>
-      </w:r>
-      <w:r>
-        <w:t xml:space="preserve">— the exact innovation/tech seat the 08-04 sourcing effort was built to reach — already said no on the old copy, before that build shipped.</w:t>
-      </w:r>
-    </w:p>
-    <w:bookmarkEnd w:id="16"/>
-    <w:bookmarkStart w:id="17" w:name="X93f99666f53be7bb362a600e5abb322e9afb799"/>
-    <w:p>
-      <w:pPr>
-        <w:pStyle w:val="Heading3"/>
-      </w:pPr>
-      <w:r>
-        <w:t xml:space="preserve">4. Four people escalated past</w:t>
-      </w:r>
-      <w:r>
-        <w:t xml:space="preserve"> </w:t>
-      </w:r>
-      <w:r>
-        <w:t xml:space="preserve">“no”</w:t>
-      </w:r>
-      <w:r>
-        <w:t xml:space="preserve"> </w:t>
-      </w:r>
-      <w:r>
-        <w:t xml:space="preserve">to</w:t>
-      </w:r>
-      <w:r>
-        <w:t xml:space="preserve"> </w:t>
-      </w:r>
-      <w:r>
-        <w:t xml:space="preserve">“remove me.”</w:t>
-      </w:r>
-    </w:p>
-    <w:p>
-      <w:pPr>
-        <w:pStyle w:val="FirstParagraph"/>
-      </w:pPr>
-      <w:r>
-        <w:t xml:space="preserve">Miller-Davis, A-1, Marker (</w:t>
-      </w:r>
-      <w:r>
-        <w:t xml:space="preserve">“unsubscribe”</w:t>
-      </w:r>
-      <w:r>
-        <w:t xml:space="preserve">), Sampson (</w:t>
-      </w:r>
-      <w:r>
-        <w:t xml:space="preserve">“take me off your list”</w:t>
-      </w:r>
-      <w:r>
-        <w:t xml:space="preserve">). Roughly one in twelve rejections is an irritation, not a decline.</w:t>
-      </w:r>
-    </w:p>
-    <w:bookmarkEnd w:id="17"/>
-    <w:bookmarkStart w:id="18" w:name="rejections-by-campaign-generation."/>
-    <w:p>
-      <w:pPr>
-        <w:pStyle w:val="Heading3"/>
-      </w:pPr>
-      <w:r>
-        <w:t xml:space="preserve">5. Rejections by campaign generation.</w:t>
-      </w:r>
-    </w:p>
-    <w:tbl>
-      <w:tblPr>
-        <w:tblStyle w:val="Table"/>
-        <w:tblW w:type="auto" w:w="0"/>
-        <w:tblLook w:firstRow="1" w:lastRow="0" w:firstColumn="0" w:lastColumn="0" w:noHBand="0" w:noVBand="0" w:val="0020"/>
-      </w:tblPr>
-      <w:tblGrid>
-        <w:gridCol w:w="2640"/>
-        <w:gridCol w:w="2640"/>
-        <w:gridCol w:w="2640"/>
-      </w:tblGrid>
-      <w:tr>
-        <w:trPr>
-          <w:tblHeader w:val="on"/>
-        </w:trPr>
-        <w:tc>
-          <w:tcPr/>
-          <w:p>
-            <w:pPr>
-              <w:pStyle w:val="Compact"/>
-            </w:pPr>
-            <w:r>
-              <w:t xml:space="preserve">Generation</w:t>
-            </w:r>
-          </w:p>
-        </w:tc>
-        <w:tc>
-          <w:tcPr/>
-          <w:p>
-            <w:pPr>
-              <w:pStyle w:val="Compact"/>
-            </w:pPr>
-            <w:r>
-              <w:t xml:space="preserve">Not-interested replies</w:t>
-            </w:r>
-          </w:p>
-        </w:tc>
-        <w:tc>
-          <w:tcPr/>
-          <w:p>
-            <w:pPr>
-              <w:pStyle w:val="Compact"/>
-            </w:pPr>
-            <w:r>
-              <w:t xml:space="preserve">Sent</w:t>
-            </w:r>
-          </w:p>
-        </w:tc>
-      </w:tr>
-      <w:tr>
-        <w:tc>
-          <w:tcPr/>
-          <w:p>
-            <w:pPr>
-              <w:pStyle w:val="Compact"/>
-            </w:pPr>
-            <w:r>
-              <w:t xml:space="preserve">23.6 (pitch-led, first launch)</w:t>
-            </w:r>
-          </w:p>
-        </w:tc>
-        <w:tc>
-          <w:tcPr/>
-          <w:p>
-            <w:pPr>
-              <w:pStyle w:val="Compact"/>
-            </w:pPr>
-            <w:r>
-              <w:t xml:space="preserve">12</w:t>
-            </w:r>
-          </w:p>
-        </w:tc>
-        <w:tc>
-          <w:tcPr/>
-          <w:p>
-            <w:pPr>
-              <w:pStyle w:val="Compact"/>
-            </w:pPr>
-            <w:r>
-              <w:t xml:space="preserve">4,517</w:t>
-            </w:r>
-          </w:p>
-        </w:tc>
-      </w:tr>
-      <w:tr>
-        <w:tc>
-          <w:tcPr/>
-          <w:p>
-            <w:pPr>
-              <w:pStyle w:val="Compact"/>
-            </w:pPr>
-            <w:r>
-              <w:t xml:space="preserve">1.7 SMB</w:t>
-            </w:r>
-          </w:p>
-        </w:tc>
-        <w:tc>
-          <w:tcPr/>
-          <w:p>
-            <w:pPr>
-              <w:pStyle w:val="Compact"/>
-            </w:pPr>
-            <w:r>
-              <w:t xml:space="preserve">10</w:t>
-            </w:r>
-          </w:p>
-        </w:tc>
-        <w:tc>
-          <w:tcPr/>
-          <w:p>
-            <w:pPr>
-              <w:pStyle w:val="Compact"/>
-            </w:pPr>
-            <w:r>
-              <w:t xml:space="preserve">2,778</w:t>
-            </w:r>
-          </w:p>
-        </w:tc>
-      </w:tr>
-      <w:tr>
-        <w:tc>
-          <w:tcPr/>
-          <w:p>
-            <w:pPr>
-              <w:pStyle w:val="Compact"/>
-            </w:pPr>
-            <w:r>
-              <w:t xml:space="preserve">7.7</w:t>
-            </w:r>
-          </w:p>
-        </w:tc>
-        <w:tc>
-          <w:tcPr/>
-          <w:p>
-            <w:pPr>
-              <w:pStyle w:val="Compact"/>
-            </w:pPr>
-            <w:r>
-              <w:t xml:space="preserve">4</w:t>
-            </w:r>
-          </w:p>
-        </w:tc>
-        <w:tc>
-          <w:tcPr/>
-          <w:p>
-            <w:pPr>
-              <w:pStyle w:val="Compact"/>
-            </w:pPr>
-            <w:r>
-              <w:t xml:space="preserve">2,550</w:t>
-            </w:r>
-          </w:p>
-        </w:tc>
-      </w:tr>
-      <w:tr>
-        <w:tc>
-          <w:tcPr/>
-          <w:p>
-            <w:pPr>
-              <w:pStyle w:val="Compact"/>
-            </w:pPr>
-            <w:r>
-              <w:t xml:space="preserve">15.7 (relaunch)</w:t>
-            </w:r>
-          </w:p>
-        </w:tc>
-        <w:tc>
-          <w:tcPr/>
-          <w:p>
-            <w:pPr>
-              <w:pStyle w:val="Compact"/>
-            </w:pPr>
-            <w:r>
-              <w:t xml:space="preserve">12</w:t>
-            </w:r>
-          </w:p>
-        </w:tc>
-        <w:tc>
-          <w:tcPr/>
-          <w:p>
-            <w:pPr>
-              <w:pStyle w:val="Compact"/>
-            </w:pPr>
-            <w:r>
-              <w:t xml:space="preserve">7,118</w:t>
-            </w:r>
-          </w:p>
-        </w:tc>
-      </w:tr>
-      <w:tr>
-        <w:tc>
-          <w:tcPr/>
-          <w:p>
-            <w:pPr>
-              <w:pStyle w:val="Compact"/>
-            </w:pPr>
-            <w:r>
-              <w:t xml:space="preserve">29.7 (Opportunity Hunter)</w:t>
-            </w:r>
-          </w:p>
-        </w:tc>
-        <w:tc>
-          <w:tcPr/>
-          <w:p>
-            <w:pPr>
-              <w:pStyle w:val="Compact"/>
-            </w:pPr>
-            <w:r>
-              <w:t xml:space="preserve">10</w:t>
-            </w:r>
-          </w:p>
-        </w:tc>
-        <w:tc>
-          <w:tcPr/>
-          <w:p>
-            <w:pPr>
-              <w:pStyle w:val="Compact"/>
-            </w:pPr>
-            <w:r>
-              <w:t xml:space="preserve">2,897</w:t>
-            </w:r>
-          </w:p>
-        </w:tc>
-      </w:tr>
-      <w:tr>
-        <w:tc>
-          <w:tcPr/>
-          <w:p>
-            <w:pPr>
-              <w:pStyle w:val="Compact"/>
-            </w:pPr>
-            <w:r>
-              <w:t xml:space="preserve">2026-08-05 (feedback-led)</w:t>
-            </w:r>
-          </w:p>
-        </w:tc>
-        <w:tc>
-          <w:tcPr/>
-          <w:p>
-            <w:pPr>
-              <w:pStyle w:val="Compact"/>
-            </w:pPr>
-            <w:r>
-              <w:t xml:space="preserve">2</w:t>
-            </w:r>
-          </w:p>
-        </w:tc>
-        <w:tc>
-          <w:tcPr/>
-          <w:p>
-            <w:pPr>
-              <w:pStyle w:val="Compact"/>
-            </w:pPr>
-            <w:r>
-              <w:t xml:space="preserve">1,055</w:t>
-            </w:r>
-          </w:p>
-        </w:tc>
-      </w:tr>
-    </w:tbl>
-    <w:p>
-      <w:pPr>
-        <w:pStyle w:val="BodyText"/>
-      </w:pPr>
-      <w:r>
-        <w:t xml:space="preserve">The feedback campaign is only 5 sending days old and well below the volume at which any of this reads as a verdict. Its one real rejection — Timothy Allen at CNY Group — did read the whole email and declined, which tells us the copy is landing in front of the right human and is not yet the thing that changes the answer.</w:t>
-      </w:r>
-    </w:p>
-    <w:p>
-      <w:r>
-        <w:pict>
-          <v:rect style="width:0;height:1.5pt" o:hralign="center" o:hrstd="t" o:hr="t"/>
-        </w:pict>
-      </w:r>
-    </w:p>
-    <w:bookmarkEnd w:id="18"/>
-    <w:bookmarkEnd w:id="19"/>
-    <w:bookmarkStart w:id="20" w:name="what-this-points-at"/>
-    <w:p>
-      <w:pPr>
-        <w:pStyle w:val="Heading2"/>
-      </w:pPr>
-      <w:r>
-        <w:t xml:space="preserve">What this points at</w:t>
-      </w:r>
-    </w:p>
-    <w:p>
-      <w:pPr>
-        <w:pStyle w:val="FirstParagraph"/>
-      </w:pPr>
-      <w:r>
-        <w:t xml:space="preserve">The rejections say the break is</w:t>
-      </w:r>
-      <w:r>
-        <w:t xml:space="preserve"> </w:t>
-      </w:r>
-      <w:r>
-        <w:rPr>
-          <w:b/>
-          <w:bCs/>
-        </w:rPr>
-        <w:t xml:space="preserve">upstream of the message</w:t>
-      </w:r>
-      <w:r>
-        <w:t xml:space="preserve">. Before another angle is written:</w:t>
-      </w:r>
-    </w:p>
-    <w:p>
-      <w:pPr>
-        <w:pStyle w:val="Compact"/>
-        <w:numPr>
-          <w:ilvl w:val="0"/>
-          <w:numId w:val="1002"/>
-        </w:numPr>
-      </w:pPr>
-      <w:r>
-        <w:rPr>
-          <w:b/>
-          <w:bCs/>
-        </w:rPr>
-        <w:t xml:space="preserve">Gate on name–email corroboration.</w:t>
-      </w:r>
-      <w:r>
-        <w:t xml:space="preserve"> </w:t>
-      </w:r>
-      <w:r>
-        <w:t xml:space="preserve">Four confirmed wrong-name sends, one of which cost us the sender’s credibility in writing.</w:t>
-      </w:r>
-    </w:p>
-    <w:p>
-      <w:pPr>
-        <w:pStyle w:val="Compact"/>
-        <w:numPr>
-          <w:ilvl w:val="0"/>
-          <w:numId w:val="1002"/>
-        </w:numPr>
-      </w:pPr>
-      <w:r>
-        <w:rPr>
-          <w:b/>
-          <w:bCs/>
-        </w:rPr>
-        <w:t xml:space="preserve">Answer Latoria’s objection in the copy.</w:t>
-      </w:r>
-      <w:r>
-        <w:t xml:space="preserve"> </w:t>
-      </w:r>
-      <w:r>
-        <w:t xml:space="preserve">It is the only substantive objection we have received from the exact buyer, and it is exactly what the positioning was rebuilt to counter — it has never actually been put into an email.</w:t>
-      </w:r>
-    </w:p>
-    <w:bookmarkEnd w:id="20"/>
-    <w:bookmarkEnd w:id="21"/>
     <w:sectPr>
       <w:footnotePr>
         <w:numRestart w:val="eachSect"/>
@@ -3268,229 +2485,8 @@
       </w:pPr>
     </w:lvl>
   </w:abstractNum>
-  <w:abstractNum w:abstractNumId="991">
-    <w:nsid w:val="0000A991"/>
-    <w:multiLevelType w:val="multilevel"/>
-    <w:lvl w:ilvl="0">
-      <w:numFmt w:val="bullet"/>
-      <w:lvlText w:val=""/>
-      <w:lvlJc w:val="left"/>
-      <w:pPr>
-        <w:ind w:left="720" w:hanging="360"/>
-      </w:pPr>
-      <w:rPr>
-        <w:rFonts w:ascii="Symbol" w:hAnsi="Symbol" w:cs="Symbol" w:hint="default"/>
-      </w:rPr>
-    </w:lvl>
-    <w:lvl w:ilvl="1">
-      <w:numFmt w:val="bullet"/>
-      <w:lvlText w:val="o"/>
-      <w:lvlJc w:val="left"/>
-      <w:pPr>
-        <w:ind w:left="1440" w:hanging="360"/>
-      </w:pPr>
-      <w:rPr>
-        <w:rFonts w:ascii="Courier New" w:hAnsi="Courier New" w:cs="Courier New" w:hint="default"/>
-      </w:rPr>
-    </w:lvl>
-    <w:lvl w:ilvl="2">
-      <w:numFmt w:val="bullet"/>
-      <w:lvlText w:val=""/>
-      <w:lvlJc w:val="left"/>
-      <w:pPr>
-        <w:ind w:left="2160" w:hanging="360"/>
-      </w:pPr>
-      <w:rPr>
-        <w:rFonts w:ascii="Wingdings" w:hAnsi="Wingdings" w:cs="Wingdings" w:hint="default"/>
-      </w:rPr>
-    </w:lvl>
-    <w:lvl w:ilvl="3">
-      <w:numFmt w:val="bullet"/>
-      <w:lvlText w:val=""/>
-      <w:lvlJc w:val="left"/>
-      <w:pPr>
-        <w:ind w:left="2880" w:hanging="360"/>
-      </w:pPr>
-      <w:rPr>
-        <w:rFonts w:ascii="Symbol" w:hAnsi="Symbol" w:cs="Symbol" w:hint="default"/>
-      </w:rPr>
-    </w:lvl>
-    <w:lvl w:ilvl="4">
-      <w:numFmt w:val="bullet"/>
-      <w:lvlText w:val="o"/>
-      <w:lvlJc w:val="left"/>
-      <w:pPr>
-        <w:ind w:left="3600" w:hanging="360"/>
-      </w:pPr>
-      <w:rPr>
-        <w:rFonts w:ascii="Courier New" w:hAnsi="Courier New" w:cs="Courier New" w:hint="default"/>
-      </w:rPr>
-    </w:lvl>
-    <w:lvl w:ilvl="5">
-      <w:numFmt w:val="bullet"/>
-      <w:lvlText w:val=""/>
-      <w:lvlJc w:val="left"/>
-      <w:pPr>
-        <w:ind w:left="4320" w:hanging="360"/>
-      </w:pPr>
-      <w:rPr>
-        <w:rFonts w:ascii="Wingdings" w:hAnsi="Wingdings" w:cs="Wingdings" w:hint="default"/>
-      </w:rPr>
-    </w:lvl>
-    <w:lvl w:ilvl="6">
-      <w:numFmt w:val="bullet"/>
-      <w:lvlText w:val=""/>
-      <w:lvlJc w:val="left"/>
-      <w:pPr>
-        <w:ind w:left="5040" w:hanging="360"/>
-      </w:pPr>
-      <w:rPr>
-        <w:rFonts w:ascii="Symbol" w:hAnsi="Symbol" w:cs="Symbol" w:hint="default"/>
-      </w:rPr>
-    </w:lvl>
-    <w:lvl w:ilvl="7">
-      <w:numFmt w:val="bullet"/>
-      <w:lvlText w:val="o"/>
-      <w:lvlJc w:val="left"/>
-      <w:pPr>
-        <w:ind w:left="5760" w:hanging="360"/>
-      </w:pPr>
-      <w:rPr>
-        <w:rFonts w:ascii="Courier New" w:hAnsi="Courier New" w:cs="Courier New" w:hint="default"/>
-      </w:rPr>
-    </w:lvl>
-    <w:lvl w:ilvl="8">
-      <w:numFmt w:val="bullet"/>
-      <w:lvlText w:val=""/>
-      <w:lvlJc w:val="left"/>
-      <w:pPr>
-        <w:ind w:left="6480" w:hanging="360"/>
-      </w:pPr>
-      <w:rPr>
-        <w:rFonts w:ascii="Wingdings" w:hAnsi="Wingdings" w:cs="Wingdings" w:hint="default"/>
-      </w:rPr>
-    </w:lvl>
-  </w:abstractNum>
-  <w:abstractNum w:abstractNumId="99411">
-    <w:nsid w:val="00A99411"/>
-    <w:multiLevelType w:val="multilevel"/>
-    <w:lvl w:ilvl="0">
-      <w:start w:val="1"/>
-      <w:numFmt w:val="decimal"/>
-      <w:lvlText w:val="%1."/>
-      <w:lvlJc w:val="left"/>
-      <w:pPr>
-        <w:ind w:left="720" w:hanging="360"/>
-      </w:pPr>
-    </w:lvl>
-    <w:lvl w:ilvl="1">
-      <w:start w:val="1"/>
-      <w:numFmt w:val="decimal"/>
-      <w:lvlText w:val="%2."/>
-      <w:lvlJc w:val="left"/>
-      <w:pPr>
-        <w:ind w:left="1440" w:hanging="360"/>
-      </w:pPr>
-    </w:lvl>
-    <w:lvl w:ilvl="2">
-      <w:start w:val="1"/>
-      <w:numFmt w:val="decimal"/>
-      <w:lvlText w:val="%3."/>
-      <w:lvlJc w:val="left"/>
-      <w:pPr>
-        <w:ind w:left="2160" w:hanging="360"/>
-      </w:pPr>
-    </w:lvl>
-    <w:lvl w:ilvl="3">
-      <w:start w:val="1"/>
-      <w:numFmt w:val="decimal"/>
-      <w:lvlText w:val="%4."/>
-      <w:lvlJc w:val="left"/>
-      <w:pPr>
-        <w:ind w:left="2880" w:hanging="360"/>
-      </w:pPr>
-    </w:lvl>
-    <w:lvl w:ilvl="4">
-      <w:start w:val="1"/>
-      <w:numFmt w:val="decimal"/>
-      <w:lvlText w:val="%5."/>
-      <w:lvlJc w:val="left"/>
-      <w:pPr>
-        <w:ind w:left="3600" w:hanging="360"/>
-      </w:pPr>
-    </w:lvl>
-    <w:lvl w:ilvl="5">
-      <w:start w:val="1"/>
-      <w:numFmt w:val="decimal"/>
-      <w:lvlText w:val="%6."/>
-      <w:lvlJc w:val="left"/>
-      <w:pPr>
-        <w:ind w:left="4320" w:hanging="360"/>
-      </w:pPr>
-    </w:lvl>
-    <w:lvl w:ilvl="6">
-      <w:start w:val="1"/>
-      <w:numFmt w:val="decimal"/>
-      <w:lvlText w:val="%7."/>
-      <w:lvlJc w:val="left"/>
-      <w:pPr>
-        <w:ind w:left="5040" w:hanging="360"/>
-      </w:pPr>
-    </w:lvl>
-    <w:lvl w:ilvl="7">
-      <w:start w:val="1"/>
-      <w:numFmt w:val="decimal"/>
-      <w:lvlText w:val="%8."/>
-      <w:lvlJc w:val="left"/>
-      <w:pPr>
-        <w:ind w:left="5760" w:hanging="360"/>
-      </w:pPr>
-    </w:lvl>
-    <w:lvl w:ilvl="8">
-      <w:start w:val="1"/>
-      <w:numFmt w:val="decimal"/>
-      <w:lvlText w:val="%9."/>
-      <w:lvlJc w:val="left"/>
-      <w:pPr>
-        <w:ind w:left="6480" w:hanging="360"/>
-      </w:pPr>
-    </w:lvl>
-  </w:abstractNum>
   <w:num w:numId="1000">
     <w:abstractNumId w:val="990"/>
-  </w:num>
-  <w:num w:numId="1001">
-    <w:abstractNumId w:val="991"/>
-  </w:num>
-  <w:num w:numId="1002">
-    <w:abstractNumId w:val="99411"/>
-    <w:lvlOverride w:ilvl="0">
-      <w:startOverride w:val="1"/>
-    </w:lvlOverride>
-    <w:lvlOverride w:ilvl="1">
-      <w:startOverride w:val="1"/>
-    </w:lvlOverride>
-    <w:lvlOverride w:ilvl="2">
-      <w:startOverride w:val="1"/>
-    </w:lvlOverride>
-    <w:lvlOverride w:ilvl="3">
-      <w:startOverride w:val="1"/>
-    </w:lvlOverride>
-    <w:lvlOverride w:ilvl="4">
-      <w:startOverride w:val="1"/>
-    </w:lvlOverride>
-    <w:lvlOverride w:ilvl="5">
-      <w:startOverride w:val="1"/>
-    </w:lvlOverride>
-    <w:lvlOverride w:ilvl="6">
-      <w:startOverride w:val="1"/>
-    </w:lvlOverride>
-    <w:lvlOverride w:ilvl="7">
-      <w:startOverride w:val="1"/>
-    </w:lvlOverride>
-    <w:lvlOverride w:ilvl="8">
-      <w:startOverride w:val="1"/>
-    </w:lvlOverride>
   </w:num>
 </w:numbering>
 </file>

</xml_diff>